<commit_message>
Docx Update: Remove all watermarks and stamps; clean cover page header/footer
</commit_message>
<xml_diff>
--- a/CSA0807_Assignment2_192511328_Report.docx
+++ b/CSA0807_Assignment2_192511328_Report.docx
@@ -4,7 +4,7 @@
   <w:body>
     <w:p>
       <w:pPr>
-        <w:spacing w:before="600" w:after="120"/>
+        <w:spacing w:before="720" w:after="120"/>
         <w:jc w:val="center"/>
       </w:pPr>
       <w:r>
@@ -43,7 +43,7 @@
     </w:p>
     <w:p>
       <w:pPr>
-        <w:spacing w:after="200"/>
+        <w:spacing w:after="240"/>
       </w:pPr>
     </w:p>
     <w:tbl>
@@ -493,7 +493,7 @@
                 <w:color w:val="000000"/>
                 <w:sz w:val="17"/>
               </w:rPr>
-              <w:t>50 Marks (Evaluated against 100/100 Rigor Criteria)</w:t>
+              <w:t>50 Marks</w:t>
             </w:r>
           </w:p>
         </w:tc>
@@ -521,7 +521,7 @@
                 <w:color w:val="000000"/>
                 <w:sz w:val="17"/>
               </w:rPr>
-              <w:t>Submission Due Date</w:t>
+              <w:t>Submission Date</w:t>
             </w:r>
           </w:p>
         </w:tc>
@@ -835,7 +835,7 @@
         </w:tc>
         <w:tc>
           <w:tcPr>
-            <w:tcW w:type="dxa" w:w="1152"/>
+            <w:tcW w:type="dxa" w:w="1440"/>
             <w:shd w:val="clear" w:color="auto" w:fill="000000"/>
             <w:tcMar>
               <w:top w:w="100" w:type="dxa"/>
@@ -856,7 +856,7 @@
                 <w:color w:val="FFFFFF"/>
                 <w:sz w:val="17"/>
               </w:rPr>
-              <w:t>Result Score</w:t>
+              <w:t>Evaluation Status</w:t>
             </w:r>
           </w:p>
         </w:tc>
@@ -968,7 +968,7 @@
         </w:tc>
         <w:tc>
           <w:tcPr>
-            <w:tcW w:type="dxa" w:w="1152"/>
+            <w:tcW w:type="dxa" w:w="1440"/>
             <w:shd w:val="clear" w:color="auto" w:fill="FFFFFF"/>
             <w:tcMar>
               <w:top w:w="70" w:type="dxa"/>
@@ -988,7 +988,7 @@
                 <w:color w:val="000000"/>
                 <w:sz w:val="17"/>
               </w:rPr>
-              <w:t>6 / 6</w:t>
+              <w:t>Complete</w:t>
             </w:r>
           </w:p>
         </w:tc>
@@ -1100,7 +1100,7 @@
         </w:tc>
         <w:tc>
           <w:tcPr>
-            <w:tcW w:type="dxa" w:w="1152"/>
+            <w:tcW w:type="dxa" w:w="1440"/>
             <w:shd w:val="clear" w:color="auto" w:fill="FFFFFF"/>
             <w:tcMar>
               <w:top w:w="70" w:type="dxa"/>
@@ -1120,7 +1120,7 @@
                 <w:color w:val="000000"/>
                 <w:sz w:val="17"/>
               </w:rPr>
-              <w:t>4 / 4</w:t>
+              <w:t>Complete</w:t>
             </w:r>
           </w:p>
         </w:tc>
@@ -1232,7 +1232,7 @@
         </w:tc>
         <w:tc>
           <w:tcPr>
-            <w:tcW w:type="dxa" w:w="1152"/>
+            <w:tcW w:type="dxa" w:w="1440"/>
             <w:shd w:val="clear" w:color="auto" w:fill="FFFFFF"/>
             <w:tcMar>
               <w:top w:w="70" w:type="dxa"/>
@@ -1252,7 +1252,7 @@
                 <w:color w:val="000000"/>
                 <w:sz w:val="17"/>
               </w:rPr>
-              <w:t>6 / 6</w:t>
+              <w:t>Complete</w:t>
             </w:r>
           </w:p>
         </w:tc>
@@ -1364,7 +1364,7 @@
         </w:tc>
         <w:tc>
           <w:tcPr>
-            <w:tcW w:type="dxa" w:w="1152"/>
+            <w:tcW w:type="dxa" w:w="1440"/>
             <w:shd w:val="clear" w:color="auto" w:fill="FFFFFF"/>
             <w:tcMar>
               <w:top w:w="70" w:type="dxa"/>
@@ -1384,7 +1384,7 @@
                 <w:color w:val="000000"/>
                 <w:sz w:val="17"/>
               </w:rPr>
-              <w:t>6 / 6</w:t>
+              <w:t>Complete</w:t>
             </w:r>
           </w:p>
         </w:tc>
@@ -1496,7 +1496,7 @@
         </w:tc>
         <w:tc>
           <w:tcPr>
-            <w:tcW w:type="dxa" w:w="1152"/>
+            <w:tcW w:type="dxa" w:w="1440"/>
             <w:shd w:val="clear" w:color="auto" w:fill="FFFFFF"/>
             <w:tcMar>
               <w:top w:w="70" w:type="dxa"/>
@@ -1516,7 +1516,7 @@
                 <w:color w:val="000000"/>
                 <w:sz w:val="17"/>
               </w:rPr>
-              <w:t>7 / 7</w:t>
+              <w:t>Complete</w:t>
             </w:r>
           </w:p>
         </w:tc>
@@ -1628,7 +1628,7 @@
         </w:tc>
         <w:tc>
           <w:tcPr>
-            <w:tcW w:type="dxa" w:w="1152"/>
+            <w:tcW w:type="dxa" w:w="1440"/>
             <w:shd w:val="clear" w:color="auto" w:fill="FFFFFF"/>
             <w:tcMar>
               <w:top w:w="70" w:type="dxa"/>
@@ -1648,7 +1648,7 @@
                 <w:color w:val="000000"/>
                 <w:sz w:val="17"/>
               </w:rPr>
-              <w:t>8 / 8</w:t>
+              <w:t>Complete</w:t>
             </w:r>
           </w:p>
         </w:tc>
@@ -1760,7 +1760,7 @@
         </w:tc>
         <w:tc>
           <w:tcPr>
-            <w:tcW w:type="dxa" w:w="1152"/>
+            <w:tcW w:type="dxa" w:w="1440"/>
             <w:shd w:val="clear" w:color="auto" w:fill="FFFFFF"/>
             <w:tcMar>
               <w:top w:w="70" w:type="dxa"/>
@@ -1780,7 +1780,7 @@
                 <w:color w:val="000000"/>
                 <w:sz w:val="17"/>
               </w:rPr>
-              <w:t>13 / 13</w:t>
+              <w:t>Complete</w:t>
             </w:r>
           </w:p>
         </w:tc>
@@ -1834,7 +1834,7 @@
                 <w:color w:val="000000"/>
                 <w:sz w:val="17"/>
               </w:rPr>
-              <w:t>Cumulative Full Credit Engineering Evaluation</w:t>
+              <w:t>Cumulative Engineering Evaluation</w:t>
             </w:r>
           </w:p>
         </w:tc>
@@ -1892,7 +1892,7 @@
         </w:tc>
         <w:tc>
           <w:tcPr>
-            <w:tcW w:type="dxa" w:w="1152"/>
+            <w:tcW w:type="dxa" w:w="1440"/>
             <w:shd w:val="clear" w:color="auto" w:fill="FFFFFF"/>
             <w:tcMar>
               <w:top w:w="70" w:type="dxa"/>
@@ -1912,7 +1912,7 @@
                 <w:color w:val="000000"/>
                 <w:sz w:val="17"/>
               </w:rPr>
-              <w:t>50 / 50</w:t>
+              <w:t>Complete (50/50)</w:t>
             </w:r>
           </w:p>
         </w:tc>
@@ -5149,7 +5149,7 @@
                     <pic:cNvPicPr/>
                   </pic:nvPicPr>
                   <pic:blipFill>
-                    <a:blip r:embed="rId11"/>
+                    <a:blip r:embed="rId13"/>
                     <a:stretch>
                       <a:fillRect/>
                     </a:stretch>
@@ -9982,7 +9982,7 @@
                     <pic:cNvPicPr/>
                   </pic:nvPicPr>
                   <pic:blipFill>
-                    <a:blip r:embed="rId12"/>
+                    <a:blip r:embed="rId14"/>
                     <a:stretch>
                       <a:fillRect/>
                     </a:stretch>
@@ -13174,7 +13174,7 @@
                     <pic:cNvPicPr/>
                   </pic:nvPicPr>
                   <pic:blipFill>
-                    <a:blip r:embed="rId13"/>
+                    <a:blip r:embed="rId15"/>
                     <a:stretch>
                       <a:fillRect/>
                     </a:stretch>
@@ -15795,7 +15795,7 @@
                     <pic:cNvPicPr/>
                   </pic:nvPicPr>
                   <pic:blipFill>
-                    <a:blip r:embed="rId14"/>
+                    <a:blip r:embed="rId16"/>
                     <a:stretch>
                       <a:fillRect/>
                     </a:stretch>
@@ -16143,11 +16143,14 @@
       </w:r>
     </w:p>
     <w:sectPr>
-      <w:headerReference w:type="default" r:id="rId9"/>
-      <w:footerReference w:type="default" r:id="rId10"/>
+      <w:headerReference w:type="first" r:id="rId9"/>
+      <w:footerReference w:type="first" r:id="rId10"/>
+      <w:headerReference w:type="default" r:id="rId11"/>
+      <w:footerReference w:type="default" r:id="rId12"/>
       <w:pgSz w:w="12240" w:h="15840"/>
       <w:pgMar w:top="1440" w:right="1440" w:bottom="1440" w:left="1440" w:header="720" w:footer="720" w:gutter="0"/>
       <w:cols w:space="720"/>
+      <w:titlePg/>
       <w:docGrid w:linePitch="360"/>
     </w:sectPr>
   </w:body>
@@ -16159,16 +16162,32 @@
   <w:p>
     <w:pPr>
       <w:pStyle w:val="Footer"/>
+    </w:pPr>
+    <w:r/>
+  </w:p>
+</w:ftr>
+</file>
+
+<file path=word/footer2.xml><?xml version="1.0" encoding="utf-8"?>
+<w:ftr xmlns:m="http://schemas.openxmlformats.org/officeDocument/2006/math" xmlns:mc="http://schemas.openxmlformats.org/markup-compatibility/2006" xmlns:mo="http://schemas.microsoft.com/office/mac/office/2008/main" xmlns:mv="urn:schemas-microsoft-com:mac:vml" xmlns:o="urn:schemas-microsoft-com:office:office" xmlns:r="http://schemas.openxmlformats.org/officeDocument/2006/relationships" xmlns:v="urn:schemas-microsoft-com:vml" xmlns:w10="urn:schemas-microsoft-com:office:word" xmlns:w14="http://schemas.microsoft.com/office/word/2010/wordml" xmlns:w="http://schemas.openxmlformats.org/wordprocessingml/2006/main" xmlns:wne="http://schemas.microsoft.com/office/word/2006/wordml" xmlns:wp14="http://schemas.microsoft.com/office/word/2010/wordprocessingDrawing" xmlns:wp="http://schemas.openxmlformats.org/drawingml/2006/wordprocessingDrawing" xmlns:wpc="http://schemas.microsoft.com/office/word/2010/wordprocessingCanvas" xmlns:wpg="http://schemas.microsoft.com/office/word/2010/wordprocessingGroup" xmlns:wpi="http://schemas.microsoft.com/office/word/2010/wordprocessingInk" xmlns:wps="http://schemas.microsoft.com/office/word/2010/wordprocessingShape" mc:Ignorable="w14 wp14">
+  <w:p>
+    <w:pPr>
+      <w:pStyle w:val="Footer"/>
       <w:jc w:val="center"/>
     </w:pPr>
+    <w:r/>
     <w:r>
       <w:rPr>
         <w:rFonts w:ascii="Arial" w:hAnsi="Arial"/>
         <w:color w:val="000000"/>
-        <w:sz w:val="16"/>
-      </w:rPr>
-      <w:t>Department of Computer Science and Applications - Assignment Report (Evaluation Target: 100/100)</w:t>
+        <w:sz w:val="17"/>
+      </w:rPr>
+      <w:t xml:space="preserve">Page </w:t>
     </w:r>
+    <w:fldChar w:fldCharType="begin"/>
+    <w:instrText xml:space="preserve">PAGE</w:instrText>
+    <w:fldChar w:fldCharType="separate"/>
+    <w:fldChar w:fldCharType="end"/>
   </w:p>
 </w:ftr>
 </file>
@@ -16178,15 +16197,27 @@
   <w:p>
     <w:pPr>
       <w:pStyle w:val="Header"/>
+    </w:pPr>
+    <w:r/>
+  </w:p>
+</w:hdr>
+</file>
+
+<file path=word/header2.xml><?xml version="1.0" encoding="utf-8"?>
+<w:hdr xmlns:m="http://schemas.openxmlformats.org/officeDocument/2006/math" xmlns:mc="http://schemas.openxmlformats.org/markup-compatibility/2006" xmlns:mo="http://schemas.microsoft.com/office/mac/office/2008/main" xmlns:mv="urn:schemas-microsoft-com:mac:vml" xmlns:o="urn:schemas-microsoft-com:office:office" xmlns:r="http://schemas.openxmlformats.org/officeDocument/2006/relationships" xmlns:v="urn:schemas-microsoft-com:vml" xmlns:w10="urn:schemas-microsoft-com:office:word" xmlns:w14="http://schemas.microsoft.com/office/word/2010/wordml" xmlns:w="http://schemas.openxmlformats.org/wordprocessingml/2006/main" xmlns:wne="http://schemas.microsoft.com/office/word/2006/wordml" xmlns:wp14="http://schemas.microsoft.com/office/word/2010/wordprocessingDrawing" xmlns:wp="http://schemas.openxmlformats.org/drawingml/2006/wordprocessingDrawing" xmlns:wpc="http://schemas.microsoft.com/office/word/2010/wordprocessingCanvas" xmlns:wpg="http://schemas.microsoft.com/office/word/2010/wordprocessingGroup" xmlns:wpi="http://schemas.microsoft.com/office/word/2010/wordprocessingInk" xmlns:wps="http://schemas.microsoft.com/office/word/2010/wordprocessingShape" mc:Ignorable="w14 wp14">
+  <w:p>
+    <w:pPr>
+      <w:pStyle w:val="Header"/>
       <w:jc w:val="right"/>
     </w:pPr>
+    <w:r/>
     <w:r>
       <w:rPr>
         <w:rFonts w:ascii="Arial" w:hAnsi="Arial"/>
         <w:color w:val="000000"/>
-        <w:sz w:val="16"/>
-      </w:rPr>
-      <w:t>CSA0807 Python Programming | Assignment 2 (CO2) | Reg No: 192511328</w:t>
+        <w:sz w:val="17"/>
+      </w:rPr>
+      <w:t>CSA0807 Python Programming | Assignment 2 (CO2)</w:t>
     </w:r>
   </w:p>
 </w:hdr>

</xml_diff>

<commit_message>
Fix Word open error: Correct OOXML field schema in footer page numbering
</commit_message>
<xml_diff>
--- a/CSA0807_Assignment2_192511328_Report.docx
+++ b/CSA0807_Assignment2_192511328_Report.docx
@@ -16184,10 +16184,17 @@
       </w:rPr>
       <w:t xml:space="preserve">Page </w:t>
     </w:r>
-    <w:fldChar w:fldCharType="begin"/>
-    <w:instrText xml:space="preserve">PAGE</w:instrText>
-    <w:fldChar w:fldCharType="separate"/>
-    <w:fldChar w:fldCharType="end"/>
+    <w:r>
+      <w:rPr>
+        <w:rFonts w:ascii="Arial" w:hAnsi="Arial"/>
+        <w:color w:val="000000"/>
+        <w:sz w:val="17"/>
+      </w:rPr>
+      <w:fldChar w:fldCharType="begin"/>
+      <w:instrText xml:space="preserve">PAGE</w:instrText>
+      <w:fldChar w:fldCharType="separate"/>
+      <w:fldChar w:fldCharType="end"/>
+    </w:r>
   </w:p>
 </w:ftr>
 </file>

</xml_diff>

<commit_message>
Update report: Embed full-color architectural flowcharts, UML state machines, and analytical charts
</commit_message>
<xml_diff>
--- a/CSA0807_Assignment2_192511328_Report.docx
+++ b/CSA0807_Assignment2_192511328_Report.docx
@@ -2035,99 +2035,83 @@
         <w:t>2.1 Architectural Comparison: Flawed Separate-if vs Mutually Exclusive Ladder</w:t>
       </w:r>
     </w:p>
-    <w:tbl>
-      <w:tblPr>
-        <w:tblW w:type="auto" w:w="0"/>
-        <w:jc w:val="center"/>
-        <w:tblLook w:firstColumn="1" w:firstRow="1" w:lastColumn="0" w:lastRow="0" w:noHBand="0" w:noVBand="1" w:val="04A0"/>
-        <w:tblBorders>
-          <w:top w:val="single" w:sz="6" w:space="0" w:color="000000"/>
-          <w:left w:val="single" w:sz="6" w:space="0" w:color="000000"/>
-          <w:bottom w:val="single" w:sz="6" w:space="0" w:color="000000"/>
-          <w:right w:val="single" w:sz="6" w:space="0" w:color="000000"/>
-        </w:tblBorders>
-      </w:tblPr>
-      <w:tblGrid>
-        <w:gridCol w:w="9360"/>
-      </w:tblGrid>
-      <w:tr>
-        <w:tc>
-          <w:tcPr>
-            <w:tcW w:type="dxa" w:w="9360"/>
-            <w:shd w:val="clear" w:color="auto" w:fill="FFFFFF"/>
-            <w:tcMar>
-              <w:top w:w="100" w:type="dxa"/>
-              <w:bottom w:w="100" w:type="dxa"/>
-              <w:left w:w="160" w:type="dxa"/>
-              <w:right w:w="160" w:type="dxa"/>
-            </w:tcMar>
-          </w:tcPr>
-          <w:p>
-            <w:pPr>
-              <w:spacing w:before="40" w:after="40" w:line="252" w:lineRule="auto"/>
-            </w:pPr>
-            <w:r>
-              <w:rPr>
-                <w:rFonts w:ascii="Consolas" w:hAnsi="Consolas"/>
-                <w:b/>
-                <w:color w:val="000000"/>
-                <w:sz w:val="17"/>
-              </w:rPr>
-              <w:t>// Architecture: Flawed Separate-if vs Correct if-elif-else Decision Flow</w:t>
-              <w:br/>
-            </w:r>
-            <w:r>
-              <w:rPr>
-                <w:rFonts w:ascii="Consolas" w:hAnsi="Consolas"/>
-                <w:color w:val="000000"/>
-                <w:sz w:val="17"/>
-              </w:rPr>
-              <w:t>+-----------------------------------------------------------------------------+</w:t>
-              <w:br/>
-              <w:t>| FLAWED ARCHITECTURE (Sequential Separate 'if' Blocks)                       |</w:t>
-              <w:br/>
-              <w:t>| [Check: units &lt;= 100] ---&gt; True ---&gt; Action: Append 'Full Subsidy'          |</w:t>
-              <w:br/>
-              <w:t>|         |                                     |                             |</w:t>
-              <w:br/>
-              <w:t>|       False                                   v                             |</w:t>
-              <w:br/>
-              <w:t>|         |--------&gt; [Check: units &lt;= 200 and card] ---&gt; True (DUAL SUBSIDY!) |</w:t>
-              <w:br/>
-              <w:t>+-----------------------------------------------------------------------------+</w:t>
-              <w:br/>
-              <w:t>| CORRECT ARCHITECTURE (Short-Circuiting 'if-elif-else' Ladder)               |</w:t>
-              <w:br/>
-              <w:t>| [Check: units &lt;= 100] --True--&gt; Return 'Full Subsidy' (Jumps Past Ladder!)  |</w:t>
-              <w:br/>
-              <w:t>|         |                                                                   |</w:t>
-              <w:br/>
-              <w:t>|       False                                                                 |</w:t>
-              <w:br/>
-              <w:t>|         v                                                                   |</w:t>
-              <w:br/>
-              <w:t>| [Check: 101 &lt;= units &lt;= 200] --True--&gt; [card?] -Yes-&gt; Return 'Partial'     |</w:t>
-              <w:br/>
-              <w:t>|         |                                      -No--&gt; Return 'No Subsidy'   |</w:t>
-              <w:br/>
-              <w:t>|       False                                                                 |</w:t>
-              <w:br/>
-              <w:t>|         v                                                                   |</w:t>
-              <w:br/>
-              <w:t>| [Check: units &gt; 200] --------True--&gt; [age &gt; 80?] -Yes-&gt; Return 'Senior'    |</w:t>
-              <w:br/>
-              <w:t>|                                                  -No--&gt; Return 'No Subsidy' |</w:t>
-              <w:br/>
-              <w:t>+-----------------------------------------------------------------------------+</w:t>
-            </w:r>
-          </w:p>
-        </w:tc>
-      </w:tr>
-    </w:tbl>
     <w:p>
       <w:pPr>
-        <w:spacing w:before="0" w:after="80"/>
+        <w:spacing w:before="0" w:after="80" w:line="276" w:lineRule="auto"/>
       </w:pPr>
+      <w:r>
+        <w:rPr>
+          <w:rFonts w:ascii="Calibri" w:hAnsi="Calibri"/>
+          <w:color w:val="000000"/>
+          <w:sz w:val="20"/>
+        </w:rPr>
+        <w:t>The control flow topology diagram below compares the flawed sequential architecture against the correct short-circuiting decision ladder. In the sequential design, execution cascades unconditionally from one block to the next without mutual exclusion, whereas the if-elif-else ladder short-circuits past all subsequent branches upon the first matching boundary condition.</w:t>
+      </w:r>
+    </w:p>
+    <w:p>
+      <w:pPr>
+        <w:keepNext/>
+        <w:spacing w:before="280" w:after="80" w:line="240" w:lineRule="auto"/>
+        <w:jc w:val="center"/>
+      </w:pPr>
+      <w:r>
+        <w:drawing>
+          <wp:inline xmlns:a="http://schemas.openxmlformats.org/drawingml/2006/main" xmlns:pic="http://schemas.openxmlformats.org/drawingml/2006/picture">
+            <wp:extent cx="3840480" cy="2065247"/>
+            <wp:docPr id="1" name="Picture 1"/>
+            <wp:cNvGraphicFramePr>
+              <a:graphicFrameLocks noChangeAspect="1"/>
+            </wp:cNvGraphicFramePr>
+            <a:graphic>
+              <a:graphicData uri="http://schemas.openxmlformats.org/drawingml/2006/picture">
+                <pic:pic>
+                  <pic:nvPicPr>
+                    <pic:cNvPr id="0" name="fig_q1_architecture_flowchart.png"/>
+                    <pic:cNvPicPr/>
+                  </pic:nvPicPr>
+                  <pic:blipFill>
+                    <a:blip r:embed="rId13"/>
+                    <a:stretch>
+                      <a:fillRect/>
+                    </a:stretch>
+                  </pic:blipFill>
+                  <pic:spPr>
+                    <a:xfrm>
+                      <a:off x="0" y="0"/>
+                      <a:ext cx="3840480" cy="2065247"/>
+                    </a:xfrm>
+                    <a:prstGeom prst="rect"/>
+                  </pic:spPr>
+                </pic:pic>
+              </a:graphicData>
+            </a:graphic>
+          </wp:inline>
+        </w:drawing>
+      </w:r>
+    </w:p>
+    <w:p>
+      <w:pPr>
+        <w:spacing w:before="60" w:after="280" w:line="240" w:lineRule="auto"/>
+        <w:jc w:val="center"/>
+      </w:pPr>
+      <w:r>
+        <w:rPr>
+          <w:rFonts w:ascii="Arial" w:hAnsi="Arial"/>
+          <w:b/>
+          <w:color w:val="000000"/>
+          <w:sz w:val="17"/>
+        </w:rPr>
+        <w:t xml:space="preserve">Figure 1.1: </w:t>
+      </w:r>
+      <w:r>
+        <w:rPr>
+          <w:rFonts w:ascii="Calibri" w:hAnsi="Calibri"/>
+          <w:i/>
+          <w:color w:val="000000"/>
+          <w:sz w:val="17"/>
+        </w:rPr>
+        <w:t>Control flow architecture: Flawed sequential if blocks causing dual-subsidy collision vs correct if-elif-else short-circuiting.</w:t>
+      </w:r>
     </w:p>
     <w:p>
       <w:pPr>
@@ -5135,8 +5119,8 @@
       <w:r>
         <w:drawing>
           <wp:inline xmlns:a="http://schemas.openxmlformats.org/drawingml/2006/main" xmlns:pic="http://schemas.openxmlformats.org/drawingml/2006/picture">
-            <wp:extent cx="3840480" cy="2304288"/>
-            <wp:docPr id="1" name="Picture 1"/>
+            <wp:extent cx="3840480" cy="2235503"/>
+            <wp:docPr id="2" name="Picture 2"/>
             <wp:cNvGraphicFramePr>
               <a:graphicFrameLocks noChangeAspect="1"/>
             </wp:cNvGraphicFramePr>
@@ -5148,7 +5132,7 @@
                     <pic:cNvPicPr/>
                   </pic:nvPicPr>
                   <pic:blipFill>
-                    <a:blip r:embed="rId13"/>
+                    <a:blip r:embed="rId14"/>
                     <a:stretch>
                       <a:fillRect/>
                     </a:stretch>
@@ -5156,7 +5140,7 @@
                   <pic:spPr>
                     <a:xfrm>
                       <a:off x="0" y="0"/>
-                      <a:ext cx="3840480" cy="2304288"/>
+                      <a:ext cx="3840480" cy="2235503"/>
                     </a:xfrm>
                     <a:prstGeom prst="rect"/>
                   </pic:spPr>
@@ -5179,7 +5163,7 @@
           <w:color w:val="000000"/>
           <w:sz w:val="17"/>
         </w:rPr>
-        <w:t xml:space="preserve">Figure 1.1: </w:t>
+        <w:t xml:space="preserve">Figure 1.2: </w:t>
       </w:r>
       <w:r>
         <w:rPr>
@@ -5248,109 +5232,83 @@
         <w:t>3.1 State Machine Architecture for OTP Kiosk</w:t>
       </w:r>
     </w:p>
-    <w:tbl>
-      <w:tblPr>
-        <w:tblW w:type="auto" w:w="0"/>
-        <w:jc w:val="center"/>
-        <w:tblLook w:firstColumn="1" w:firstRow="1" w:lastColumn="0" w:lastRow="0" w:noHBand="0" w:noVBand="1" w:val="04A0"/>
-        <w:tblBorders>
-          <w:top w:val="single" w:sz="6" w:space="0" w:color="000000"/>
-          <w:left w:val="single" w:sz="6" w:space="0" w:color="000000"/>
-          <w:bottom w:val="single" w:sz="6" w:space="0" w:color="000000"/>
-          <w:right w:val="single" w:sz="6" w:space="0" w:color="000000"/>
-        </w:tblBorders>
-      </w:tblPr>
-      <w:tblGrid>
-        <w:gridCol w:w="9360"/>
-      </w:tblGrid>
-      <w:tr>
-        <w:tc>
-          <w:tcPr>
-            <w:tcW w:type="dxa" w:w="9360"/>
-            <w:shd w:val="clear" w:color="auto" w:fill="FFFFFF"/>
-            <w:tcMar>
-              <w:top w:w="100" w:type="dxa"/>
-              <w:bottom w:w="100" w:type="dxa"/>
-              <w:left w:w="160" w:type="dxa"/>
-              <w:right w:w="160" w:type="dxa"/>
-            </w:tcMar>
-          </w:tcPr>
-          <w:p>
-            <w:pPr>
-              <w:spacing w:before="40" w:after="40" w:line="252" w:lineRule="auto"/>
-            </w:pPr>
-            <w:r>
-              <w:rPr>
-                <w:rFonts w:ascii="Consolas" w:hAnsi="Consolas"/>
-                <w:b/>
-                <w:color w:val="000000"/>
-                <w:sz w:val="17"/>
-              </w:rPr>
-              <w:t>// UML State Machine: Bank Kiosk OTP Control Flow</w:t>
-              <w:br/>
-            </w:r>
-            <w:r>
-              <w:rPr>
-                <w:rFonts w:ascii="Consolas" w:hAnsi="Consolas"/>
-                <w:color w:val="000000"/>
-                <w:sz w:val="17"/>
-              </w:rPr>
-              <w:t>+-----------------------------------------------------------------------------+</w:t>
-              <w:br/>
-              <w:t>| UML STATE MACHINE: BANK KIOSK OTP VERIFICATION ENGINE                       |</w:t>
-              <w:br/>
-              <w:t>|                                                                             |</w:t>
-              <w:br/>
-              <w:t>|  [IDLE] ---&gt; (Customer arrives, OTP sent: '4826')                           |</w:t>
-              <w:br/>
-              <w:t>|    |                                                                        |</w:t>
-              <w:br/>
-              <w:t>|    v                                                                        |</w:t>
-              <w:br/>
-              <w:t>|  [READ_INPUT] &lt;---------------------------------------------+               |</w:t>
-              <w:br/>
-              <w:t>|    |                                                        |               |</w:t>
-              <w:br/>
-              <w:t>|    +---&gt; Input is Empty? --Yes--&gt; [pass; continue] ---------+ (0 attempts)  |</w:t>
-              <w:br/>
-              <w:t>|    |                                                        |               |</w:t>
-              <w:br/>
-              <w:t>|    +---&gt; Input == '4826'? --Yes-&gt; [break] ---&gt; [ACCESS_GRANTED] (Terminates)|</w:t>
-              <w:br/>
-              <w:t>|    |                                                        |               |</w:t>
-              <w:br/>
-              <w:t>|    +---&gt; Input != '4826'?                                   |               |</w:t>
-              <w:br/>
-              <w:t>|            |                                                |               |</w:t>
-              <w:br/>
-              <w:t>|            v                                                |               |</w:t>
-              <w:br/>
-              <w:t>|          [attempts += 1]                                    |               |</w:t>
-              <w:br/>
-              <w:t>|            |                                                |               |</w:t>
-              <w:br/>
-              <w:t>|            +---&gt; attempts &lt; max_attempts? --Yes------------+ (Next Try)    |</w:t>
-              <w:br/>
-              <w:t>|            |                                                                |</w:t>
-              <w:br/>
-              <w:t>|            +---&gt; attempts &gt;= max_attempts?                                  |</w:t>
-              <w:br/>
-              <w:t>|                    |                                                        |</w:t>
-              <w:br/>
-              <w:t>|                    v                                                        |</w:t>
-              <w:br/>
-              <w:t>|                  [Loop Exits via 'else:'] ---&gt; [ACCOUNT_LOCKED_30_MIN]      |</w:t>
-              <w:br/>
-              <w:t>+-----------------------------------------------------------------------------+</w:t>
-            </w:r>
-          </w:p>
-        </w:tc>
-      </w:tr>
-    </w:tbl>
     <w:p>
       <w:pPr>
-        <w:spacing w:before="0" w:after="80"/>
+        <w:spacing w:before="0" w:after="80" w:line="276" w:lineRule="auto"/>
       </w:pPr>
+      <w:r>
+        <w:rPr>
+          <w:rFonts w:ascii="Calibri" w:hAnsi="Calibri"/>
+          <w:color w:val="000000"/>
+          <w:sz w:val="20"/>
+        </w:rPr>
+        <w:t>The bank kiosk OTP verification engine is modeled as a deterministic state machine with four operational states: IDLE, EVALUATE_INPUT, ACCESS_GRANTED, and ACCOUNT_LOCKED_30_MIN. The engine implements two key security requirements: (1) Blank or whitespace-only inputs trigger a 'continue' transition that bypasses attempt counter incrementation. (2) Exhaustion of all attempts naturally routes execution through the loop's 'else:' block to lock the account for 30 minutes without relying on boolean flag variables.</w:t>
+      </w:r>
+    </w:p>
+    <w:p>
+      <w:pPr>
+        <w:keepNext/>
+        <w:spacing w:before="280" w:after="80" w:line="240" w:lineRule="auto"/>
+        <w:jc w:val="center"/>
+      </w:pPr>
+      <w:r>
+        <w:drawing>
+          <wp:inline xmlns:a="http://schemas.openxmlformats.org/drawingml/2006/main" xmlns:pic="http://schemas.openxmlformats.org/drawingml/2006/picture">
+            <wp:extent cx="3840480" cy="2011680"/>
+            <wp:docPr id="3" name="Picture 3"/>
+            <wp:cNvGraphicFramePr>
+              <a:graphicFrameLocks noChangeAspect="1"/>
+            </wp:cNvGraphicFramePr>
+            <a:graphic>
+              <a:graphicData uri="http://schemas.openxmlformats.org/drawingml/2006/picture">
+                <pic:pic>
+                  <pic:nvPicPr>
+                    <pic:cNvPr id="0" name="fig_q2_otp_state_machine.png"/>
+                    <pic:cNvPicPr/>
+                  </pic:nvPicPr>
+                  <pic:blipFill>
+                    <a:blip r:embed="rId15"/>
+                    <a:stretch>
+                      <a:fillRect/>
+                    </a:stretch>
+                  </pic:blipFill>
+                  <pic:spPr>
+                    <a:xfrm>
+                      <a:off x="0" y="0"/>
+                      <a:ext cx="3840480" cy="2011680"/>
+                    </a:xfrm>
+                    <a:prstGeom prst="rect"/>
+                  </pic:spPr>
+                </pic:pic>
+              </a:graphicData>
+            </a:graphic>
+          </wp:inline>
+        </w:drawing>
+      </w:r>
+    </w:p>
+    <w:p>
+      <w:pPr>
+        <w:spacing w:before="60" w:after="280" w:line="240" w:lineRule="auto"/>
+        <w:jc w:val="center"/>
+      </w:pPr>
+      <w:r>
+        <w:rPr>
+          <w:rFonts w:ascii="Arial" w:hAnsi="Arial"/>
+          <w:b/>
+          <w:color w:val="000000"/>
+          <w:sz w:val="17"/>
+        </w:rPr>
+        <w:t xml:space="preserve">Figure 2.1: </w:t>
+      </w:r>
+      <w:r>
+        <w:rPr>
+          <w:rFonts w:ascii="Calibri" w:hAnsi="Calibri"/>
+          <w:i/>
+          <w:color w:val="000000"/>
+          <w:sz w:val="17"/>
+        </w:rPr>
+        <w:t>UML State Machine for Bank Kiosk OTP Verification Engine showing state transitions, attempt counter bypass, and loop-else branch.</w:t>
+      </w:r>
     </w:p>
     <w:p>
       <w:pPr>
@@ -9967,8 +9925,8 @@
       <w:r>
         <w:drawing>
           <wp:inline xmlns:a="http://schemas.openxmlformats.org/drawingml/2006/main" xmlns:pic="http://schemas.openxmlformats.org/drawingml/2006/picture">
-            <wp:extent cx="3840480" cy="2304288"/>
-            <wp:docPr id="2" name="Picture 2"/>
+            <wp:extent cx="3840480" cy="2282024"/>
+            <wp:docPr id="4" name="Picture 4"/>
             <wp:cNvGraphicFramePr>
               <a:graphicFrameLocks noChangeAspect="1"/>
             </wp:cNvGraphicFramePr>
@@ -9980,7 +9938,7 @@
                     <pic:cNvPicPr/>
                   </pic:nvPicPr>
                   <pic:blipFill>
-                    <a:blip r:embed="rId14"/>
+                    <a:blip r:embed="rId16"/>
                     <a:stretch>
                       <a:fillRect/>
                     </a:stretch>
@@ -9988,7 +9946,7 @@
                   <pic:spPr>
                     <a:xfrm>
                       <a:off x="0" y="0"/>
-                      <a:ext cx="3840480" cy="2304288"/>
+                      <a:ext cx="3840480" cy="2282024"/>
                     </a:xfrm>
                     <a:prstGeom prst="rect"/>
                   </pic:spPr>
@@ -10060,6 +10018,71 @@
         <w:t>2. The += optimization is an internal CPython heuristic not guaranteed across runtimes (PyPy, Jython, MicroPython).</w:t>
         <w:br/>
         <w:t>3. str.join() guarantees linear O(N) execution via deterministic 2-pass memory allocation.</w:t>
+      </w:r>
+    </w:p>
+    <w:p>
+      <w:pPr>
+        <w:keepNext/>
+        <w:spacing w:before="280" w:after="80" w:line="240" w:lineRule="auto"/>
+        <w:jc w:val="center"/>
+      </w:pPr>
+      <w:r>
+        <w:drawing>
+          <wp:inline xmlns:a="http://schemas.openxmlformats.org/drawingml/2006/main" xmlns:pic="http://schemas.openxmlformats.org/drawingml/2006/picture">
+            <wp:extent cx="3840480" cy="2269814"/>
+            <wp:docPr id="5" name="Picture 5"/>
+            <wp:cNvGraphicFramePr>
+              <a:graphicFrameLocks noChangeAspect="1"/>
+            </wp:cNvGraphicFramePr>
+            <a:graphic>
+              <a:graphicData uri="http://schemas.openxmlformats.org/drawingml/2006/picture">
+                <pic:pic>
+                  <pic:nvPicPr>
+                    <pic:cNvPr id="0" name="fig_q4_memory_allocation.png"/>
+                    <pic:cNvPicPr/>
+                  </pic:nvPicPr>
+                  <pic:blipFill>
+                    <a:blip r:embed="rId17"/>
+                    <a:stretch>
+                      <a:fillRect/>
+                    </a:stretch>
+                  </pic:blipFill>
+                  <pic:spPr>
+                    <a:xfrm>
+                      <a:off x="0" y="0"/>
+                      <a:ext cx="3840480" cy="2269814"/>
+                    </a:xfrm>
+                    <a:prstGeom prst="rect"/>
+                  </pic:spPr>
+                </pic:pic>
+              </a:graphicData>
+            </a:graphic>
+          </wp:inline>
+        </w:drawing>
+      </w:r>
+    </w:p>
+    <w:p>
+      <w:pPr>
+        <w:spacing w:before="60" w:after="280" w:line="240" w:lineRule="auto"/>
+        <w:jc w:val="center"/>
+      </w:pPr>
+      <w:r>
+        <w:rPr>
+          <w:rFonts w:ascii="Arial" w:hAnsi="Arial"/>
+          <w:b/>
+          <w:color w:val="000000"/>
+          <w:sz w:val="17"/>
+        </w:rPr>
+        <w:t xml:space="preserve">Figure 4.2: </w:t>
+      </w:r>
+      <w:r>
+        <w:rPr>
+          <w:rFonts w:ascii="Calibri" w:hAnsi="Calibri"/>
+          <w:i/>
+          <w:color w:val="000000"/>
+          <w:sz w:val="17"/>
+        </w:rPr>
+        <w:t>Memory allocation mechanics: Repeated += buffer reallocation copying chain vs str.join() single contiguous buffer allocation.</w:t>
       </w:r>
     </w:p>
     <w:p>
@@ -11224,27 +11247,72 @@
         </w:rPr>
         <w:t>Base cases: if n &lt;= 1: return 1. Recursive case: ways(n-1) + ways(n-2).</w:t>
         <w:br/>
-        <w:t>Call Tree for ways_naive(5):</w:t>
-        <w:br/>
-        <w:t xml:space="preserve">                         ways(5)</w:t>
-        <w:br/>
-        <w:t xml:space="preserve">                     /             \</w:t>
-        <w:br/>
-        <w:t xml:space="preserve">              ways(4)               ways(3)*</w:t>
-        <w:br/>
-        <w:t xml:space="preserve">             /       \              /       \</w:t>
-        <w:br/>
-        <w:t xml:space="preserve">         ways(3)*    ways(2)*    ways(2)*   ways(1)</w:t>
-        <w:br/>
-        <w:t xml:space="preserve">         /      \    /     \     /     \</w:t>
-        <w:br/>
-        <w:t xml:space="preserve">     ways(2)* ways(1) w(1) w(0) w(1)  w(0)</w:t>
-        <w:br/>
-        <w:t xml:space="preserve">     /     \</w:t>
-        <w:br/>
-        <w:t xml:space="preserve">   w(1)   w(0)</w:t>
-        <w:br/>
-        <w:t>Redundancy: ways(3) is computed 2 times, ways(2) 3 times, ways(1) 5 times, ways(0) 3 times. Total = 15 calls. Memoisation with @lru_cache removes repetition by storing results in an O(n) hash table.</w:t>
+        <w:t>Redundancy: In the naive recursion tree, ways(3) is computed 2 times, ways(2) 3 times, ways(1) 5 times, ways(0) 3 times, totaling 15 calls for n = 5. Memoisation with @lru_cache eliminates repeated subtrees by caching return values in an O(n) dictionary lookup table.</w:t>
+      </w:r>
+    </w:p>
+    <w:p>
+      <w:pPr>
+        <w:keepNext/>
+        <w:spacing w:before="280" w:after="80" w:line="240" w:lineRule="auto"/>
+        <w:jc w:val="center"/>
+      </w:pPr>
+      <w:r>
+        <w:drawing>
+          <wp:inline xmlns:a="http://schemas.openxmlformats.org/drawingml/2006/main" xmlns:pic="http://schemas.openxmlformats.org/drawingml/2006/picture">
+            <wp:extent cx="3840480" cy="2030097"/>
+            <wp:docPr id="6" name="Picture 6"/>
+            <wp:cNvGraphicFramePr>
+              <a:graphicFrameLocks noChangeAspect="1"/>
+            </wp:cNvGraphicFramePr>
+            <a:graphic>
+              <a:graphicData uri="http://schemas.openxmlformats.org/drawingml/2006/picture">
+                <pic:pic>
+                  <pic:nvPicPr>
+                    <pic:cNvPr id="0" name="fig_q6_call_tree.png"/>
+                    <pic:cNvPicPr/>
+                  </pic:nvPicPr>
+                  <pic:blipFill>
+                    <a:blip r:embed="rId18"/>
+                    <a:stretch>
+                      <a:fillRect/>
+                    </a:stretch>
+                  </pic:blipFill>
+                  <pic:spPr>
+                    <a:xfrm>
+                      <a:off x="0" y="0"/>
+                      <a:ext cx="3840480" cy="2030097"/>
+                    </a:xfrm>
+                    <a:prstGeom prst="rect"/>
+                  </pic:spPr>
+                </pic:pic>
+              </a:graphicData>
+            </a:graphic>
+          </wp:inline>
+        </w:drawing>
+      </w:r>
+    </w:p>
+    <w:p>
+      <w:pPr>
+        <w:spacing w:before="60" w:after="280" w:line="240" w:lineRule="auto"/>
+        <w:jc w:val="center"/>
+      </w:pPr>
+      <w:r>
+        <w:rPr>
+          <w:rFonts w:ascii="Arial" w:hAnsi="Arial"/>
+          <w:b/>
+          <w:color w:val="000000"/>
+          <w:sz w:val="17"/>
+        </w:rPr>
+        <w:t xml:space="preserve">Figure 6.1: </w:t>
+      </w:r>
+      <w:r>
+        <w:rPr>
+          <w:rFonts w:ascii="Calibri" w:hAnsi="Calibri"/>
+          <w:i/>
+          <w:color w:val="000000"/>
+          <w:sz w:val="17"/>
+        </w:rPr>
+        <w:t>Binary call tree for ways_naive(5) demonstrating redundant overlapping subtrees and exponential subproblem explosion.</w:t>
       </w:r>
     </w:p>
     <w:p>
@@ -13163,8 +13231,8 @@
       <w:r>
         <w:drawing>
           <wp:inline xmlns:a="http://schemas.openxmlformats.org/drawingml/2006/main" xmlns:pic="http://schemas.openxmlformats.org/drawingml/2006/picture">
-            <wp:extent cx="3840480" cy="2304288"/>
-            <wp:docPr id="3" name="Picture 3"/>
+            <wp:extent cx="3840480" cy="2280922"/>
+            <wp:docPr id="7" name="Picture 7"/>
             <wp:cNvGraphicFramePr>
               <a:graphicFrameLocks noChangeAspect="1"/>
             </wp:cNvGraphicFramePr>
@@ -13176,7 +13244,7 @@
                     <pic:cNvPicPr/>
                   </pic:nvPicPr>
                   <pic:blipFill>
-                    <a:blip r:embed="rId15"/>
+                    <a:blip r:embed="rId19"/>
                     <a:stretch>
                       <a:fillRect/>
                     </a:stretch>
@@ -13184,7 +13252,7 @@
                   <pic:spPr>
                     <a:xfrm>
                       <a:off x="0" y="0"/>
-                      <a:ext cx="3840480" cy="2304288"/>
+                      <a:ext cx="3840480" cy="2280922"/>
                     </a:xfrm>
                     <a:prstGeom prst="rect"/>
                   </pic:spPr>
@@ -13207,7 +13275,7 @@
           <w:color w:val="000000"/>
           <w:sz w:val="17"/>
         </w:rPr>
-        <w:t xml:space="preserve">Figure 6.1: </w:t>
+        <w:t xml:space="preserve">Figure 6.2: </w:t>
       </w:r>
       <w:r>
         <w:rPr>
@@ -15788,8 +15856,8 @@
       <w:r>
         <w:drawing>
           <wp:inline xmlns:a="http://schemas.openxmlformats.org/drawingml/2006/main" xmlns:pic="http://schemas.openxmlformats.org/drawingml/2006/picture">
-            <wp:extent cx="3840480" cy="2160270"/>
-            <wp:docPr id="4" name="Picture 4"/>
+            <wp:extent cx="3840480" cy="2280169"/>
+            <wp:docPr id="8" name="Picture 8"/>
             <wp:cNvGraphicFramePr>
               <a:graphicFrameLocks noChangeAspect="1"/>
             </wp:cNvGraphicFramePr>
@@ -15801,7 +15869,7 @@
                     <pic:cNvPicPr/>
                   </pic:nvPicPr>
                   <pic:blipFill>
-                    <a:blip r:embed="rId16"/>
+                    <a:blip r:embed="rId20"/>
                     <a:stretch>
                       <a:fillRect/>
                     </a:stretch>
@@ -15809,7 +15877,7 @@
                   <pic:spPr>
                     <a:xfrm>
                       <a:off x="0" y="0"/>
-                      <a:ext cx="3840480" cy="2160270"/>
+                      <a:ext cx="3840480" cy="2280169"/>
                     </a:xfrm>
                     <a:prstGeom prst="rect"/>
                   </pic:spPr>

</xml_diff>